<commit_message>
Tidy punctuation and document details
</commit_message>
<xml_diff>
--- a/manuscript/Nair_Izima_Multimodal_Driving_Risk_Prediction.docx
+++ b/manuscript/Nair_Izima_Multimodal_Driving_Risk_Prediction.docx
@@ -229,7 +229,7 @@
           <w:sz w:val="22"/>
           <w:szCs w:val="22"/>
         </w:rPr>
-        <w:t xml:space="preserve">Despite this progress, there is an evident gap concerning integrated, explainable models for predicting driving risk from multimodal information. Prior work has largely focused on individual tasks — object detection from vehicle-mounted cameras or accident anticipation — without a unifying approach that combines visual, behavioural, object-level, and contextual information. Studies that apply machine learning to driving risk typically use physiological or behavioural data without integrating deeper visual features, and almost no prior work on multimodal driving behaviour provides a systematic method for explaining how each modality contributes to the final prediction. To the authors' knowledge, this study is the first to combine CNN and Vision Transformer embeddings within a single driving risk prediction model.</w:t>
+        <w:t xml:space="preserve">Despite this progress, there is an evident gap concerning integrated, explainable models for predicting driving risk from multimodal information. Prior work has largely focused on individual tasks (object detection from vehicle-mounted cameras or accident anticipation) without a unifying approach that combines visual, behavioural, object-level, and contextual information. Studies that apply machine learning to driving risk typically use physiological or behavioural data without integrating deeper visual features, and almost no prior work on multimodal driving behaviour provides a systematic method for explaining how each modality contributes to the final prediction. To the authors' knowledge, this study is the first to combine CNN and Vision Transformer embeddings within a single driving risk prediction model.</w:t>
       </w:r>
     </w:p>
     <w:p>
@@ -335,7 +335,7 @@
           <w:sz w:val="22"/>
           <w:szCs w:val="22"/>
         </w:rPr>
-        <w:t xml:space="preserve">Autonomous vehicles represent perhaps the most complex artificial intelligence application yet conceived, requiring the fusion of perception, prediction, planning, and control in real time. Grigorescu et al. (2020) conducted an extensive review of deep learning methods across the entire AV perception stack, documenting the progression from rule-based systems towards end-to-end deep learning architectures and showing that no single architecture is sufficient for all AV tasks — individual tasks impose unique requirements on their learning paradigms. Viktor and Kiss (2026) demonstrate that cameras, LiDAR, radar, and GPS each carry distinct advantages and failure modes, providing the theoretical justification for the multimodal fusion approach this study builds upon. Beck et al. (2023) further demonstrate the benefits of multimodal sensor data in AV crash reconstruction, showing that LiDAR, camera, and radar streams can be fused for detailed accident investigations, thereby validating the use of combined AV sensor data for safety-critical analyses.</w:t>
+        <w:t xml:space="preserve">Autonomous vehicles represent perhaps the most complex artificial intelligence application yet conceived, requiring the fusion of perception, prediction, planning, and control in real time. Grigorescu et al. (2020) conducted an extensive review of deep learning methods across the entire AV perception stack, documenting the progression from rule-based systems towards end-to-end deep learning architectures and showing that no single architecture is sufficient for all AV tasks; individual tasks impose unique requirements on their learning paradigms. Viktor and Kiss (2026) demonstrate that cameras, LiDAR, radar, and GPS each carry distinct advantages and failure modes, providing the theoretical justification for the multimodal fusion approach this study builds upon. Beck et al. (2023) further demonstrate the benefits of multimodal sensor data in AV crash reconstruction, showing that LiDAR, camera, and radar streams can be fused for detailed accident investigations, thereby validating the use of combined AV sensor data for safety-critical analyses.</w:t>
       </w:r>
     </w:p>
     <w:p>
@@ -353,7 +353,7 @@
           <w:sz w:val="22"/>
           <w:szCs w:val="22"/>
         </w:rPr>
-        <w:t xml:space="preserve">Large-scale, well-annotated datasets have been key to AV research progress. The KITTI Vision Benchmark Suite (Geiger et al., 2012) provided stereo images, LiDAR point clouds, and GPS data, becoming a benchmark for AV dataset development and evaluation. BDD100K (Yu et al., 2020) contributed 100,000 driving videos under varied environmental conditions, enabling multi-task model development, and the Waymo Open Dataset (Sun et al., 2020) supplied high-resolution multi-camera and LiDAR data at scale. nuScenes (Caesar et al., 2020) was specifically developed to evaluate sensor fusion, combining camera, LiDAR, and radar data with detailed 3-D annotations, and Argoverse 2 (Wilson et al., 2023) is the most recent major addition. Notably, none of these datasets includes ground-truth 'driving risk' labels, making proxy labelling methods — such as the Isolation Forest approach used in this study — necessary. A partial exception is the DoTA dataset (Yao et al., 2023), which contains 4,677 egocentric driving videos with temporal, spatial, and categorical anomaly annotations.</w:t>
+        <w:t xml:space="preserve">Large-scale, well-annotated datasets have been key to AV research progress. The KITTI Vision Benchmark Suite (Geiger et al., 2012) provided stereo images, LiDAR point clouds, and GPS data, becoming a benchmark for AV dataset development and evaluation. BDD100K (Yu et al., 2020) contributed 100,000 driving videos under varied environmental conditions, enabling multi-task model development, and the Waymo Open Dataset (Sun et al., 2020) supplied high-resolution multi-camera and LiDAR data at scale. nuScenes (Caesar et al., 2020) was specifically developed to evaluate sensor fusion, combining camera, LiDAR, and radar data with detailed 3-D annotations, and Argoverse 2 (Wilson et al., 2023) is the most recent major addition. Notably, none of these datasets includes ground-truth 'driving risk' labels, making proxy labelling methods, such as the Isolation Forest approach used in this study, necessary. A partial exception is the DoTA dataset (Yao et al., 2023), which contains 4,677 egocentric driving videos with temporal, spatial, and categorical anomaly annotations.</w:t>
       </w:r>
     </w:p>
     <w:p>
@@ -371,7 +371,7 @@
           <w:sz w:val="22"/>
           <w:szCs w:val="22"/>
         </w:rPr>
-        <w:t xml:space="preserve">On the modelling side, CNNs have underpinned most AV visual feature extraction since the mid-2010s. ResNet (He et al., 2016) demonstrated that very deep networks can be trained successfully using residual connections, achieving state-of-the-art ImageNet results and establishing the ResNet family as the most commonly adopted backbone for AV perception pipelines. The Vision Transformer (Dosovitskiy et al., 2021) created a new paradigm by treating an image as a sequence of patches processed through self-attention, matching state-of-the-art CNN classification performance without convolution. Unlike CNNs, which learn hierarchical representations from local spatial relationships, ViT captures global spatial relationships across entire scenes — a key property for holistic understanding of driving scenarios. BEVFormer (Li et al., 2022) extended transformer architectures to multi-camera spatial perception, generating bird's-eye-view representations without LiDAR through spatiotemporal attention, and Ma et al. (2023) documented how CNN-only methods are being displaced by transformer-based methods across multi-camera benchmarks. These studies raise — but do not answer — the question of whether CNN and ViT embeddings are complementary or redundant when combined in a risk prediction system, which is a central question of this paper.</w:t>
+        <w:t xml:space="preserve">On the modelling side, CNNs have underpinned most AV visual feature extraction since the mid-2010s. ResNet (He et al., 2016) demonstrated that very deep networks can be trained successfully using residual connections, achieving state-of-the-art ImageNet results and establishing the ResNet family as the most commonly adopted backbone for AV perception pipelines. The Vision Transformer (Dosovitskiy et al., 2021) created a new paradigm by treating an image as a sequence of patches processed through self-attention, matching state-of-the-art CNN classification performance without convolution. Unlike CNNs, which learn hierarchical representations from local spatial relationships, ViT captures global spatial relationships across entire scenes, a key property for holistic understanding of driving scenarios. BEVFormer (Li et al., 2022) extended transformer architectures to multi-camera spatial perception, generating bird's-eye-view representations without LiDAR through spatiotemporal attention, and Ma et al. (2023) documented how CNN-only methods are being displaced by transformer-based methods across multi-camera benchmarks. These studies raise, but do not answer, the question of whether CNN and ViT embeddings are complementary or redundant when combined in a risk prediction system, which is a central question of this paper.</w:t>
       </w:r>
     </w:p>
     <w:p>
@@ -406,7 +406,7 @@
           <w:sz w:val="22"/>
           <w:szCs w:val="22"/>
         </w:rPr>
-        <w:t xml:space="preserve">Object detection enables vehicles to detect and localise relevant road entities — pedestrians, vehicles, and hazards — in real time. YOLO (Redmon et al., 2016) reformulated object detection as a single regression problem within a unified architecture, achieving much faster inference than two-stage detectors, while Faster R-CNN (Ren et al., 2015) attains higher accuracy through Region Proposal Networks at greater computational cost; both underpin the YOLOv8 model used in this study. Baek et al. (2020) demonstrated that the density and composition of detected objects — particularly pedestrian and cyclist presence and multiple-vehicle counts — relate directly to collision likelihood, motivating the inclusion of YOLOv8 object-count features as a discrete input modality in the present framework.</w:t>
+        <w:t xml:space="preserve">Object detection enables vehicles to detect and localise relevant road entities (pedestrians, vehicles, and hazards) in real time. YOLO (Redmon et al., 2016) reformulated object detection as a single regression problem within a unified architecture, achieving much faster inference than two-stage detectors, while Faster R-CNN (Ren et al., 2015) attains higher accuracy through Region Proposal Networks at greater computational cost; both underpin the YOLOv8 model used in this study. Baek et al. (2020) demonstrated that the density and composition of detected objects, particularly pedestrian and cyclist presence and multiple-vehicle counts, relate directly to collision likelihood, motivating the inclusion of YOLOv8 object-count features as a discrete input modality in the present framework.</w:t>
       </w:r>
     </w:p>
     <w:p>
@@ -424,7 +424,7 @@
           <w:sz w:val="22"/>
           <w:szCs w:val="22"/>
         </w:rPr>
-        <w:t xml:space="preserve">Within driving risk prediction, Guagnano et al. (2023) showed that XGBoost outperformed other classifiers when predicting structured driving risk from physiological, personal, behavioural, and environmental factors in a simulated environment — providing justification for its selection as the primary classifier here, while also illustrating the limits of purely non-visual inputs. Fu et al. (2023) developed a hybrid CNN–BiLSTM network for predicting driving behaviour risk from sensor data, and Wang et al. (2019) proposed a multi-feature risk prediction framework based on behavioural and road features. A shared limitation across these studies is dependence on fully labelled crash records or physiological measurements that are impractical to obtain at scale in real-world AV deployments.</w:t>
+        <w:t xml:space="preserve">Within driving risk prediction, Guagnano et al. (2023) showed that XGBoost outperformed other classifiers when predicting structured driving risk from physiological, personal, behavioural, and environmental factors in a simulated environment, providing justification for its selection as the primary classifier here, while also illustrating the limits of purely non-visual inputs. Fu et al. (2023) developed a hybrid CNN–BiLSTM network for predicting driving behaviour risk from sensor data, and Wang et al. (2019) proposed a multi-feature risk prediction framework based on behavioural and road features. A shared limitation across these studies is dependence on fully labelled crash records or physiological measurements that are impractical to obtain at scale in real-world AV deployments.</w:t>
       </w:r>
     </w:p>
     <w:p>
@@ -442,7 +442,7 @@
           <w:sz w:val="22"/>
           <w:szCs w:val="22"/>
         </w:rPr>
-        <w:t xml:space="preserve">In accident anticipation and anomaly detection, Kataoka et al. (2018), Bao et al. (2021), Fang et al. (2021), and Liao et al. (2024) developed models that anticipate crashes from visual data. However, these approaches require very large volumes of labelled video, or use complex temporal models unsuited to short clips, and focus on crash prediction rather than explaining model behaviour. Recent multimodal and context-aware work reinforces the value of integration: Wang et al. (2025) incorporate driving risk into a hybrid state space for deep-reinforcement-learning-based AV decision making; Xue et al. (2025) show that a driving-risk-field car-following model incorporating surrounding-vehicle context estimates crash risk better than single-vehicle behaviour alone; Wu et al. (2024) combine visual perception with risk assessment for safer behavioural planning; and Baek et al. (2020) found that fusing sensor data with contextual communication information improved collision warning over either source alone. Collectively, these studies suggest that understanding the operational context — who else is present, what time it is, how the environment appears — is at least as critical to estimating driving risk as perceiving the vehicle's immediate state.</w:t>
+        <w:t xml:space="preserve">In accident anticipation and anomaly detection, Kataoka et al. (2018), Bao et al. (2021), Fang et al. (2021), and Liao et al. (2024) developed models that anticipate crashes from visual data. However, these approaches require very large volumes of labelled video, or use complex temporal models unsuited to short clips, and focus on crash prediction rather than explaining model behaviour. Recent multimodal and context-aware work reinforces the value of integration: Wang et al. (2025) incorporate driving risk into a hybrid state space for deep-reinforcement-learning-based AV decision making; Xue et al. (2025) show that a driving-risk-field car-following model incorporating surrounding-vehicle context estimates crash risk better than single-vehicle behaviour alone; Wu et al. (2024) combine visual perception with risk assessment for safer behavioural planning; and Baek et al. (2020) found that fusing sensor data with contextual communication information improved collision warning over either source alone. Collectively, these studies suggest that understanding the operational context (who else is present, what time it is, how the environment appears) is at least as critical to estimating driving risk as perceiving the vehicle's immediate state.</w:t>
       </w:r>
     </w:p>
     <w:p>
@@ -476,7 +476,7 @@
           <w:sz w:val="20"/>
           <w:szCs w:val="20"/>
         </w:rPr>
-        <w:t xml:space="preserve">Table 1 — Summary of key related works.</w:t>
+        <w:t xml:space="preserve">Table 1. Summary of key related works.</w:t>
       </w:r>
     </w:p>
     <w:tbl>
@@ -2013,7 +2013,7 @@
           <w:sz w:val="20"/>
           <w:szCs w:val="20"/>
         </w:rPr>
-        <w:t xml:space="preserve">Figure 1 — CRISP-DM framework applied to this research.</w:t>
+        <w:t xml:space="preserve">Figure 1. CRISP-DM framework applied to this research.</w:t>
       </w:r>
     </w:p>
     <w:p>
@@ -2048,7 +2048,7 @@
           <w:sz w:val="22"/>
           <w:szCs w:val="22"/>
         </w:rPr>
-        <w:t xml:space="preserve">The NVIDIA PhysicalAI Autonomous Vehicle Dataset (NVIDIA, 2025) served as the empirical base. Available via an authenticated Hugging Face account, it offers multimodal autonomous driving data — ego-motion telemetry, front-wide camera imagery, and extensive clip-level metadata — captured in real-world settings across multiple countries, times of day, and lighting conditions. The dataset is collected and maintained by NVIDIA's Autonomous Vehicle R&amp;D Division under the supervision of Prof. Marco Pavone, lending it considerable scientific credibility. Three reasons motivated its selection: it offers genuinely multimodal AV data enabling the extraction of multimodal features; it captures real-world driving under diverse environmental conditions, enhancing ecological validity; and its public availability supports replicability.</w:t>
+        <w:t xml:space="preserve">The NVIDIA PhysicalAI Autonomous Vehicle Dataset (NVIDIA, 2025) served as the empirical base. Available via an authenticated Hugging Face account, it offers multimodal autonomous driving data (ego-motion telemetry, front-wide camera imagery, and extensive clip-level metadata) captured in real-world settings across multiple countries, times of day, and lighting conditions. The dataset is collected and maintained by NVIDIA's Autonomous Vehicle R&amp;D Division under the supervision of Prof. Marco Pavone, lending it considerable scientific credibility. Three reasons motivated its selection: it offers genuinely multimodal AV data enabling the extraction of multimodal features; it captures real-world driving under diverse environmental conditions, enhancing ecological validity; and its public availability supports replicability.</w:t>
       </w:r>
     </w:p>
     <w:p>
@@ -2066,7 +2066,7 @@
           <w:sz w:val="22"/>
           <w:szCs w:val="22"/>
         </w:rPr>
-        <w:t xml:space="preserve">A total of 2,000 clips were sampled using a diversity-aware approach combining 1,000 rare clips identified through Isolation Forest anomaly detection and 1,000 typical clips, constrained to a maximum of 25% of clips from any single country and 150 unique segments. Anomaly scores generated during sampling were deliberately excluded from the final dataset — they served only to reduce download requirements and were never treated as features or labels, preventing any opportunity for target leakage. After quality filtering to exclude clips lacking valid ego-motion or camera data, the analytical dataset comprised 1,899 valid clips.</w:t>
+        <w:t xml:space="preserve">A total of 2,000 clips were sampled using a diversity-aware approach combining 1,000 rare clips identified through Isolation Forest anomaly detection and 1,000 typical clips, constrained to a maximum of 25% of clips from any single country and 150 unique segments. Anomaly scores generated during sampling were deliberately excluded from the final dataset; they served only to reduce download requirements and were never treated as features or labels, preventing any opportunity for target leakage. After quality filtering to exclude clips lacking valid ego-motion or camera data, the analytical dataset comprised 1,899 valid clips.</w:t>
       </w:r>
     </w:p>
     <w:p>
@@ -2117,7 +2117,7 @@
           <w:sz w:val="20"/>
           <w:szCs w:val="20"/>
         </w:rPr>
-        <w:t xml:space="preserve">Table 2 — Feature group summary: 48 features across seven groups.</w:t>
+        <w:t xml:space="preserve">Table 2. Feature group summary: 48 features across seven groups.</w:t>
       </w:r>
     </w:p>
     <w:tbl>
@@ -3092,7 +3092,7 @@
           <w:sz w:val="22"/>
           <w:szCs w:val="22"/>
         </w:rPr>
-        <w:t xml:space="preserve">Contextual and engineered features. Six contextual features were built from clip-level metadata: hour of day, month, is_night (1 for hours between 20:00 and 06:00), is_peak_hour (1 during morning and evening peak traffic periods), lighting_condition_enc (an encoded categorical variable derived from frame brightness), and is_poor_lighting (a binary flag for clips with mean brightness below 40). Three engineered composite features — aggressive_score, env_complexity, and object_density — were additionally derived by applying StandardScaler normalisation to their components so that no single component dominates by scale.</w:t>
+        <w:t xml:space="preserve">Contextual and engineered features. Six contextual features were built from clip-level metadata: hour of day, month, is_night (1 for hours between 20:00 and 06:00), is_peak_hour (1 during morning and evening peak traffic periods), lighting_condition_enc (an encoded categorical variable derived from frame brightness), and is_poor_lighting (a binary flag for clips with mean brightness below 40). Three engineered composite features (aggressive_score, env_complexity, and object_density) were additionally derived by applying StandardScaler normalisation to their components so that no single component dominates by scale.</w:t>
       </w:r>
     </w:p>
     <w:p>
@@ -3110,7 +3110,7 @@
           <w:sz w:val="22"/>
           <w:szCs w:val="22"/>
         </w:rPr>
-        <w:t xml:space="preserve">Visual features. Basic visual descriptors — mean brightness and contrast — were computed from each clip's front-wide camera middle frame using OpenCV grayscale conversion, describing lighting conditions at minimal processing cost. CNN embeddings were extracted using a pre-trained ResNet-50 (He et al., 2016) with the final classification layer removed, yielding a 2,048-dimensional penultimate feature vector per frame; inputs were resized to 224×224 pixels and normalised with ImageNet statistics, and principal component analysis (PCA) reduced the embeddings to ten components (cnn_feature_0–cnn_feature_9). ViT embeddings were produced from a pre-trained ViT-B/16 (Dosovitskiy et al., 2021), which divides each frame into 16×16 patches processed through twelve transformer encoder layers with multi-head self-attention, yielding a 768-dimensional class-token embedding; PCA was applied independently to produce ten components (vit_feature_0–vit_feature_9). PCA explained-variance diagnostics were reported for both reductions. Object-level features were extracted with a YOLOv8x model (Redmon et al., 2016; Ultralytics, 2023) applied to each clip's middle frame, counting detections across eight risk-relevant categories (person, bicycle, motorcycle, car, bus, truck, traffic light, stop sign) plus a total object count as an overall indicator of scene complexity, producing nine object-level features per clip.</w:t>
+        <w:t xml:space="preserve">Visual features. Basic visual descriptors (mean brightness and contrast) were computed from each clip's front-wide camera middle frame using OpenCV grayscale conversion, describing lighting conditions at minimal processing cost. CNN embeddings were extracted using a pre-trained ResNet-50 (He et al., 2016) with the final classification layer removed, yielding a 2,048-dimensional penultimate feature vector per frame; inputs were resized to 224×224 pixels and normalised with ImageNet statistics, and principal component analysis (PCA) reduced the embeddings to ten components (cnn_feature_0–cnn_feature_9). ViT embeddings were produced from a pre-trained ViT-B/16 (Dosovitskiy et al., 2021), which divides each frame into 16×16 patches processed through twelve transformer encoder layers with multi-head self-attention, yielding a 768-dimensional class-token embedding; PCA was applied independently to produce ten components (vit_feature_0–vit_feature_9). PCA explained-variance diagnostics were reported for both reductions. Object-level features were extracted with a YOLOv8x model (Redmon et al., 2016; Ultralytics, 2023) applied to each clip's middle frame, counting detections across eight risk-relevant categories (person, bicycle, motorcycle, car, bus, truck, traffic light, stop sign) plus a total object count as an overall indicator of scene complexity, producing nine object-level features per clip.</w:t>
       </w:r>
     </w:p>
     <w:p>
@@ -3225,7 +3225,7 @@
           <w:sz w:val="20"/>
           <w:szCs w:val="20"/>
         </w:rPr>
-        <w:t xml:space="preserve">Figure 2 — System architecture: five-notebook pipeline.</w:t>
+        <w:t xml:space="preserve">Figure 2. System architecture: five-notebook pipeline.</w:t>
       </w:r>
     </w:p>
     <w:p>
@@ -3287,7 +3287,7 @@
           <w:sz w:val="20"/>
           <w:szCs w:val="20"/>
         </w:rPr>
-        <w:t xml:space="preserve">Figure 3 — Multimodal feature fusion architecture.</w:t>
+        <w:t xml:space="preserve">Figure 3. Multimodal feature fusion architecture.</w:t>
       </w:r>
     </w:p>
     <w:p>
@@ -3305,7 +3305,7 @@
           <w:sz w:val="22"/>
           <w:szCs w:val="22"/>
         </w:rPr>
-        <w:t xml:space="preserve">Proxy risk labelling. Because ground-truth crash or risk labels are unavailable in the PhysicalAI Dataset — a common challenge in AV safety research given the rarity of real-world crash events — a proxy labelling strategy was used (Figure 4). The data were split into training and test sets before any label creation. An Isolation Forest was fitted solely on the training set's behavioural and contextual features (speed, acceleration, jerk, braking events, hour of day, is_night, is_peak_hour). The 25th percentile of training-clip anomaly scores defined the threshold below which clips were classified as elevated risk; the same fitted model and threshold were applied to the test set without refitting, guaranteeing that no test-set information influenced label creation.</w:t>
+        <w:t xml:space="preserve">Proxy risk labelling. Because ground-truth crash or risk labels are unavailable in the PhysicalAI Dataset, a common challenge in AV safety research given the rarity of real-world crash events, a proxy labelling strategy was used (Figure 4). The data were split into training and test sets before any label creation. An Isolation Forest was fitted solely on the training set's behavioural and contextual features (speed, acceleration, jerk, braking events, hour of day, is_night, is_peak_hour). The 25th percentile of training-clip anomaly scores defined the threshold below which clips were classified as elevated risk; the same fitted model and threshold were applied to the test set without refitting, guaranteeing that no test-set information influenced label creation.</w:t>
       </w:r>
     </w:p>
     <w:p>
@@ -3367,7 +3367,7 @@
           <w:sz w:val="20"/>
           <w:szCs w:val="20"/>
         </w:rPr>
-        <w:t xml:space="preserve">Figure 4 — Proxy risk labelling methodology.</w:t>
+        <w:t xml:space="preserve">Figure 4. Proxy risk labelling methodology.</w:t>
       </w:r>
     </w:p>
     <w:p>
@@ -3385,7 +3385,7 @@
           <w:sz w:val="22"/>
           <w:szCs w:val="22"/>
         </w:rPr>
-        <w:t xml:space="preserve">Label validity was established through three independent statistical strategies. First, held-out behavioural and engineered features not used in the Isolation Forest — average acceleration, environmental complexity, object density, aggressive score, and is_poor_lighting — were compared across risk classes using Mann–Whitney U tests. Second, visual features from CNN, ViT, and YOLO — entirely independent of the ego-motion-based labelling process — were tested for differences between risk classes. Third, Cohen's d effect sizes were computed across all validated features to confirm that differences were practically as well as statistically significant. Collectively, these approaches provide construct validity evidence that the proxy labels capture real driving risk patterns rather than artefacts of label creation (Figures 5 and 6).</w:t>
+        <w:t xml:space="preserve">Label validity was established through three independent statistical strategies. First, held-out behavioural and engineered features not used in the Isolation Forest (average acceleration, environmental complexity, object density, aggressive score, and is_poor_lighting) were compared across risk classes using Mann–Whitney U tests. Second, visual features from CNN, ViT, and YOLO, entirely independent of the ego-motion-based labelling process, were tested for differences between risk classes. Third, Cohen's d effect sizes were computed across all validated features to confirm that differences were practically as well as statistically significant. Collectively, these approaches provide construct validity evidence that the proxy labels capture real driving risk patterns rather than artefacts of label creation (Figures 5 and 6).</w:t>
       </w:r>
     </w:p>
     <w:p>
@@ -3447,7 +3447,7 @@
           <w:sz w:val="20"/>
           <w:szCs w:val="20"/>
         </w:rPr>
-        <w:t xml:space="preserve">Figure 5 — Proxy label validation: risk indicator distributions comparing high-risk and low-risk clips across average speed, maximum jerk, hard braking events, and night driving.</w:t>
+        <w:t xml:space="preserve">Figure 5. Proxy label validation: risk indicator distributions comparing high-risk and low-risk clips across average speed, maximum jerk, hard braking events, and night driving.</w:t>
       </w:r>
     </w:p>
     <w:p>
@@ -3509,7 +3509,7 @@
           <w:sz w:val="20"/>
           <w:szCs w:val="20"/>
         </w:rPr>
-        <w:t xml:space="preserve">Figure 6 — Extended proxy label validation: effect sizes, held-out feature comparison, and visual feature significance.</w:t>
+        <w:t xml:space="preserve">Figure 6. Extended proxy label validation: effect sizes, held-out feature comparison, and visual feature significance.</w:t>
       </w:r>
     </w:p>
     <w:p>
@@ -3545,7 +3545,7 @@
           <w:sz w:val="22"/>
           <w:szCs w:val="22"/>
         </w:rPr>
-        <w:t xml:space="preserve">Hyperparameter optimisation. Optimisation used a two-phase RandomizedSearchCV procedure with a T4 GPU accelerator, evaluated by stratified five-fold cross-validation with train scores collected to track overfitting. Phase 1 searched 80 iterations over a large hyperparameter space with maximum tree depth capped, because XGBoost is prone to memorising training data when depth exceeds values appropriate to the dataset size; it achieved a cross-validated ROC-AUC of 0.9450 with a train–CV gap of 0.0550. Phase 2 narrowed the search around Phase 1's optimum with 100 iterations and applied gap-aware selection — choosing the top cross-validated ROC-AUC among candidates with a train–CV gap below 0.08, rather than the raw best score regardless of overfitting — achieving a cross-validated ROC-AUC of 0.9455 with a gap of 0.0545. The marginal improvement (+0.0005) demonstrated convergence, so no further phases were required. The selected parameters were used to train the final XGBoost model with GPU acceleration (tree_method = hist, device = cuda); the full configuration is given in Appendix A.</w:t>
+        <w:t xml:space="preserve">Hyperparameter optimisation. Optimisation used a two-phase RandomizedSearchCV procedure with a T4 GPU accelerator, evaluated by stratified five-fold cross-validation with train scores collected to track overfitting. Phase 1 searched 80 iterations over a large hyperparameter space with maximum tree depth capped, because XGBoost is prone to memorising training data when depth exceeds values appropriate to the dataset size; it achieved a cross-validated ROC-AUC of 0.9450 with a train–CV gap of 0.0550. Phase 2 narrowed the search around Phase 1's optimum with 100 iterations and applied gap-aware selection (choosing the top cross-validated ROC-AUC among candidates with a train–CV gap below 0.08, rather than the raw best score regardless of overfitting), achieving a cross-validated ROC-AUC of 0.9455 with a gap of 0.0545. The marginal improvement (+0.0005) demonstrated convergence, so no further phases were required. The selected parameters were used to train the final XGBoost model with GPU acceleration (tree_method = hist, device = cuda); the full configuration is given in Appendix A.</w:t>
       </w:r>
     </w:p>
     <w:p>
@@ -3616,7 +3616,7 @@
           <w:sz w:val="22"/>
           <w:szCs w:val="22"/>
         </w:rPr>
-        <w:t xml:space="preserve">Threshold analysis and ablation design. Decision thresholds of 0.3, 0.4, 0.5, and 0.6 were analysed; a threshold of 0.4 was selected because it improved recall for the risk-elevated class without unduly sacrificing overall accuracy — consistent with a safety-oriented emphasis in which missed high-risk cases are more harmful than false alarms. A four-way ablation study assessed each primary feature set's contribution: the complete 48-feature multimodal model; a model with CNN and ViT visual embeddings removed; a model with all contextual and temporal features removed; and a behavioural-only baseline using ego-motion features alone. Each configuration used identical tuned hyperparameters, identical train–test splits, and the same 0.4 decision threshold, ensuring fair and direct comparison.</w:t>
+        <w:t xml:space="preserve">Threshold analysis and ablation design. Decision thresholds of 0.3, 0.4, 0.5, and 0.6 were analysed; a threshold of 0.4 was selected because it improved recall for the risk-elevated class without unduly sacrificing overall accuracy, consistent with a safety-oriented emphasis in which missed high-risk cases are more harmful than false alarms. A four-way ablation study assessed each primary feature set's contribution: the complete 48-feature multimodal model; a model with CNN and ViT visual embeddings removed; a model with all contextual and temporal features removed; and a behavioural-only baseline using ego-motion features alone. Each configuration used identical tuned hyperparameters, identical train–test splits, and the same 0.4 decision threshold, ensuring fair and direct comparison.</w:t>
       </w:r>
     </w:p>
     <w:p>
@@ -3651,7 +3651,7 @@
           <w:sz w:val="22"/>
           <w:szCs w:val="22"/>
         </w:rPr>
-        <w:t xml:space="preserve">This research used an entirely secondary, publicly accessible data source, obtained through an authenticated Hugging Face account. No primary data collection involving human subjects occurred and no personally identifiable data were collected; the dataset includes no facial images or driver identifiers, reducing privacy risk. The proxy risk labelling strategy is clearly identified throughout the study, and its potential limitations are explicitly acknowledged in the interests of research transparency. A random state of 42 was applied consistently across all stochastic components — dataset sampling, train–test splitting, model training, and cross-validation — ensuring full reproducibility of all reported results. The implementation used Python 3 with pandas 2.2.2, numpy, scikit-learn, xgboost, torch and torchvision, ultralytics, opencv-python, shap, huggingface_hub, and matplotlib.</w:t>
+        <w:t xml:space="preserve">This research used an entirely secondary, publicly accessible data source, obtained through an authenticated Hugging Face account. No primary data collection involving human subjects occurred and no personally identifiable data were collected; the dataset includes no facial images or driver identifiers, reducing privacy risk. The proxy risk labelling strategy is clearly identified throughout the study, and its potential limitations are explicitly acknowledged in the interests of research transparency. A random state of 42 was applied consistently across all stochastic components (dataset sampling, train–test splitting, model training, and cross-validation), ensuring full reproducibility of all reported results. The implementation used Python 3 with pandas 2.2.2, numpy, scikit-learn, xgboost, torch and torchvision, ultralytics, opencv-python, shap, huggingface_hub, and matplotlib.</w:t>
       </w:r>
     </w:p>
     <w:p>
@@ -3703,7 +3703,7 @@
           <w:sz w:val="22"/>
           <w:szCs w:val="22"/>
         </w:rPr>
-        <w:t xml:space="preserve">Three independent validation methods ruled out statistical artefact in the proxy risk labels. Mann–Whitney U tests applied to held-out behavioural (average acceleration) and engineered features (environmental complexity, object density, aggressive score, is_poor_lighting) produced statistically significant differences between risk classes for every tested feature (all p &lt; .05). Visual feature validation found that CNN, ViT, and YOLO features — which played no role in label creation — differed significantly between risk classes at rates far exceeding the 5% false-positive rate expected under random labelling. Cohen's d effect sizes confirmed that the differences between high-risk and low-risk clips were practically meaningful for both behavioural and visual features. Taken together, these findings constitute construct validity evidence supporting the proxy labels.</w:t>
+        <w:t xml:space="preserve">Three independent validation methods ruled out statistical artefact in the proxy risk labels. Mann–Whitney U tests applied to held-out behavioural (average acceleration) and engineered features (environmental complexity, object density, aggressive score, is_poor_lighting) produced statistically significant differences between risk classes for every tested feature (all p &lt; .05). Visual feature validation found that CNN, ViT, and YOLO features, which played no role in label creation, differed significantly between risk classes at rates far exceeding the 5% false-positive rate expected under random labelling. Cohen's d effect sizes confirmed that the differences between high-risk and low-risk clips were practically meaningful for both behavioural and visual features. Taken together, these findings constitute construct validity evidence supporting the proxy labels.</w:t>
       </w:r>
     </w:p>
     <w:p>
@@ -3754,7 +3754,7 @@
           <w:sz w:val="20"/>
           <w:szCs w:val="20"/>
         </w:rPr>
-        <w:t xml:space="preserve">Table 3 — Hyperparameter tuning progression across phases.</w:t>
+        <w:t xml:space="preserve">Table 3. Hyperparameter tuning progression across phases.</w:t>
       </w:r>
     </w:p>
     <w:tbl>
@@ -4452,7 +4452,7 @@
           <w:sz w:val="20"/>
           <w:szCs w:val="20"/>
         </w:rPr>
-        <w:t xml:space="preserve">Figure 7 — Hyperparameter tuning final selection: CV ROC-AUC across phases, overfitting gap comparison, and selected parameter values.</w:t>
+        <w:t xml:space="preserve">Figure 7. Hyperparameter tuning final selection: CV ROC-AUC across phases, overfitting gap comparison, and selected parameter values.</w:t>
       </w:r>
     </w:p>
     <w:p>
@@ -4514,7 +4514,7 @@
           <w:sz w:val="20"/>
           <w:szCs w:val="20"/>
         </w:rPr>
-        <w:t xml:space="preserve">Figure 8 — Phase 2 hyperparameter tuning analysis: phase comparison and gap distribution across all 100 candidates.</w:t>
+        <w:t xml:space="preserve">Figure 8. Phase 2 hyperparameter tuning analysis: phase comparison and gap distribution across all 100 candidates.</w:t>
       </w:r>
     </w:p>
     <w:p>
@@ -4565,7 +4565,7 @@
           <w:sz w:val="20"/>
           <w:szCs w:val="20"/>
         </w:rPr>
-        <w:t xml:space="preserve">Table 4 — Baseline model comparison at threshold 0.4.</w:t>
+        <w:t xml:space="preserve">Table 4. Baseline model comparison at threshold 0.4.</w:t>
       </w:r>
     </w:p>
     <w:tbl>
@@ -5160,7 +5160,7 @@
                 <w:sz w:val="19"/>
                 <w:szCs w:val="19"/>
               </w:rPr>
-              <w:t xml:space="preserve">XGBoost — Full Model</w:t>
+              <w:t xml:space="preserve">XGBoost (Full Model)</w:t>
             </w:r>
           </w:p>
         </w:tc>
@@ -5353,7 +5353,7 @@
           <w:sz w:val="20"/>
           <w:szCs w:val="20"/>
         </w:rPr>
-        <w:t xml:space="preserve">Table 5 — Feature group importance: gain-based ranking.</w:t>
+        <w:t xml:space="preserve">Table 5. Feature group importance: gain-based ranking.</w:t>
       </w:r>
     </w:p>
     <w:tbl>
@@ -6209,7 +6209,7 @@
           <w:sz w:val="22"/>
           <w:szCs w:val="22"/>
         </w:rPr>
-        <w:t xml:space="preserve">The SHAP beeswarm plot (Figure 9) shows that high values of is_night exerted the greatest positive influence on high-risk predictions, followed by hour_of_day and is_peak_hour — consistent with prior transportation safety research associating increased crash risk with night-time travel, peak-hour traffic, poor visibility, and reduced reaction time. Figure 10 ranks the top 20 features by mean absolute SHAP value. The SHAP waterfall plot for the highest-risk clip in the test set (Figure 11) illustrates how the model interpreted an individual clip's feature values to produce its predicted risk level, demonstrating clip-level explainability suited to real-world vehicle safety applications.</w:t>
+        <w:t xml:space="preserve">The SHAP beeswarm plot (Figure 9) shows that high values of is_night exerted the greatest positive influence on high-risk predictions, followed by hour_of_day and is_peak_hour, consistent with prior transportation safety research associating increased crash risk with night-time travel, peak-hour traffic, poor visibility, and reduced reaction time. Figure 10 ranks the top 20 features by mean absolute SHAP value. The SHAP waterfall plot for the highest-risk clip in the test set (Figure 11) illustrates how the model interpreted an individual clip's feature values to produce its predicted risk level, demonstrating clip-level explainability suited to real-world vehicle safety applications.</w:t>
       </w:r>
     </w:p>
     <w:p>
@@ -6271,7 +6271,7 @@
           <w:sz w:val="20"/>
           <w:szCs w:val="20"/>
         </w:rPr>
-        <w:t xml:space="preserve">Figure 9 — SHAP summary plot (beeswarm): feature contributions to driving risk predictions across all test clips.</w:t>
+        <w:t xml:space="preserve">Figure 9. SHAP summary plot (beeswarm): feature contributions to driving risk predictions across all test clips.</w:t>
       </w:r>
     </w:p>
     <w:p>
@@ -6333,7 +6333,7 @@
           <w:sz w:val="20"/>
           <w:szCs w:val="20"/>
         </w:rPr>
-        <w:t xml:space="preserve">Figure 10 — SHAP feature importance (mean absolute SHAP value): top 20 features ranked by average impact on model predictions.</w:t>
+        <w:t xml:space="preserve">Figure 10. SHAP feature importance (mean absolute SHAP value): top 20 features ranked by average impact on model predictions.</w:t>
       </w:r>
     </w:p>
     <w:p>
@@ -6395,7 +6395,7 @@
           <w:sz w:val="20"/>
           <w:szCs w:val="20"/>
         </w:rPr>
-        <w:t xml:space="preserve">Figure 11 — SHAP waterfall plot: feature-level explanation for the highest-risk clip in the test set.</w:t>
+        <w:t xml:space="preserve">Figure 11. SHAP waterfall plot: feature-level explanation for the highest-risk clip in the test set.</w:t>
       </w:r>
     </w:p>
     <w:p>
@@ -6446,7 +6446,7 @@
           <w:sz w:val="20"/>
           <w:szCs w:val="20"/>
         </w:rPr>
-        <w:t xml:space="preserve">Table 6 — Four-way ablation study results.</w:t>
+        <w:t xml:space="preserve">Table 6. Four-way ablation study results.</w:t>
       </w:r>
     </w:p>
     <w:tbl>
@@ -6709,7 +6709,7 @@
                 <w:sz w:val="19"/>
                 <w:szCs w:val="19"/>
               </w:rPr>
-              <w:t xml:space="preserve">A — Full Model</w:t>
+              <w:t xml:space="preserve">A: Full Model</w:t>
             </w:r>
           </w:p>
         </w:tc>
@@ -6909,7 +6909,7 @@
                 <w:sz w:val="19"/>
                 <w:szCs w:val="19"/>
               </w:rPr>
-              <w:t xml:space="preserve">B — No CNN + ViT</w:t>
+              <w:t xml:space="preserve">B: No CNN + ViT</w:t>
             </w:r>
           </w:p>
         </w:tc>
@@ -7109,7 +7109,7 @@
                 <w:sz w:val="19"/>
                 <w:szCs w:val="19"/>
               </w:rPr>
-              <w:t xml:space="preserve">C — No Context</w:t>
+              <w:t xml:space="preserve">C: No Context</w:t>
             </w:r>
           </w:p>
         </w:tc>
@@ -7309,7 +7309,7 @@
                 <w:sz w:val="19"/>
                 <w:szCs w:val="19"/>
               </w:rPr>
-              <w:t xml:space="preserve">D — Behavioural Only</w:t>
+              <w:t xml:space="preserve">D: Behavioural Only</w:t>
             </w:r>
           </w:p>
         </w:tc>
@@ -7544,7 +7544,7 @@
           <w:sz w:val="20"/>
           <w:szCs w:val="20"/>
         </w:rPr>
-        <w:t xml:space="preserve">Figure 12 — Four-way ablation study: ROC-AUC comparison, delta from full model, and all-metrics grouped comparison.</w:t>
+        <w:t xml:space="preserve">Figure 12. Four-way ablation study: ROC-AUC comparison, delta from full model, and all-metrics grouped comparison.</w:t>
       </w:r>
     </w:p>
     <w:p>
@@ -7596,7 +7596,7 @@
           <w:sz w:val="22"/>
           <w:szCs w:val="22"/>
         </w:rPr>
-        <w:t xml:space="preserve">The XGBoost multimodal framework produced a held-out test ROC-AUC of 0.9387 — a substantial improvement over the Dummy Classifier baseline of 0.500 and a clear gain over the linear logistic regression baseline (Table 4). Performance rising with model complexity is consistent with Guagnano et al. (2023), who found XGBoost to outperform other classifiers on structured driving data. This result supports the claim that the 48-feature multimodal dataset — constructed from behavioural, contextual, object-level, and visual modalities — contains sufficient information for effective driving risk prediction, answering RQ1.</w:t>
+        <w:t xml:space="preserve">The XGBoost multimodal framework produced a held-out test ROC-AUC of 0.9387, a substantial improvement over the Dummy Classifier baseline of 0.500 and a clear gain over the linear logistic regression baseline (Table 4). Performance rising with model complexity is consistent with Guagnano et al. (2023), who found XGBoost to outperform other classifiers on structured driving data. This result supports the claim that the 48-feature multimodal dataset, constructed from behavioural, contextual, object-level, and visual modalities, contains sufficient information for effective driving risk prediction, answering RQ1.</w:t>
       </w:r>
     </w:p>
     <w:p>
@@ -7631,7 +7631,7 @@
           <w:sz w:val="22"/>
           <w:szCs w:val="22"/>
         </w:rPr>
-        <w:t xml:space="preserve">Removing the CNN and ViT visual embeddings slightly increased ROC-AUC from 0.9387 to 0.9554, a gain of 0.0167. This answers RQ2 and challenges the common multimodal-fusion assumption that adding modalities always improves performance. The result may be explained by the curse of dimensionality: the embeddings added 20 PCA-based visual features to the 48-feature dataset, and although these features contained genuine risk-related signal, combining them with stronger structured features may have reduced the overall signal-to-noise ratio — particularly in tree-based ensembles where feature subsets are sampled during training (Dosovitskiy et al., 2021; Ren et al., 2015). Importantly, this does not mean visual features are irrelevant: construct validation showed significant differences between high-risk and low-risk clips in the CNN and ViT features themselves. Rather, flat concatenation may not be the most effective way to fuse visual and structured data at this dataset size. This creates a clear direction for future research — more specialised fusion architectures, such as late-fusion models or separate visual branches, may better capture the predictive value of deep visual features, as suggested by advanced AV perception architectures (Li et al., 2022; Ma et al., 2023). The finding therefore strengthens the study by identifying both a limitation of the current design and a practical path for improvement.</w:t>
+        <w:t xml:space="preserve">Removing the CNN and ViT visual embeddings slightly increased ROC-AUC from 0.9387 to 0.9554, a gain of 0.0167. This answers RQ2 and challenges the common multimodal-fusion assumption that adding modalities always improves performance. The result may be explained by the curse of dimensionality: the embeddings added 20 PCA-based visual features to the 48-feature dataset, and although these features contained genuine risk-related signal, combining them with stronger structured features may have reduced the overall signal-to-noise ratio, particularly in tree-based ensembles where feature subsets are sampled during training (Dosovitskiy et al., 2021; Ren et al., 2015). Importantly, this does not mean visual features are irrelevant: construct validation showed significant differences between high-risk and low-risk clips in the CNN and ViT features themselves. Rather, flat concatenation may not be the most effective way to fuse visual and structured data at this dataset size. This creates a clear direction for future research: more specialised fusion architectures, such as late-fusion models or separate visual branches, may better capture the predictive value of deep visual features, as suggested by advanced AV perception architectures (Li et al., 2022; Ma et al., 2023). The finding therefore strengthens the study by identifying both a limitation of the current design and a practical path for improvement.</w:t>
       </w:r>
     </w:p>
     <w:p>
@@ -7701,7 +7701,7 @@
           <w:sz w:val="22"/>
           <w:szCs w:val="22"/>
         </w:rPr>
-        <w:t xml:space="preserve">The proxy labelling technique is arguably the most significant methodological vulnerability of this study and must be assessed fairly. Isolation Forest anomaly scores measure how atypical a clip's behaviour is; they are not direct measures of crash or near-miss likelihood. A clip could be statistically anomalous yet not dangerous — for example, an unusually slow clip in heavy traffic might receive a high anomaly score without indicating elevated crash risk. Three responses were built into the study. First, train–test leakage was prevented by fitting a single model on training data only and applying the fixed model and threshold to the test set. Second, three additional construct validity tests — held-out feature testing, visual feature testing, and effect size analysis — empirically demonstrated real risk-related patterns across multiple independent feature domains. Third, the limitation is openly acknowledged, with an honest assessment of its impact on interpretation, as transparency-oriented research ethics require. As future work, external validation against datasets containing annotated risk information — such as DoTA (Yao et al., 2023) or SHRP2 Naturalistic Driving Study crash data — should be undertaken.</w:t>
+        <w:t xml:space="preserve">The proxy labelling technique is arguably the most significant methodological vulnerability of this study and must be assessed fairly. Isolation Forest anomaly scores measure how atypical a clip's behaviour is; they are not direct measures of crash or near-miss likelihood. A clip could be statistically anomalous yet not dangerous; for example, an unusually slow clip in heavy traffic might receive a high anomaly score without indicating elevated crash risk. Three responses were built into the study. First, train–test leakage was prevented by fitting a single model on training data only and applying the fixed model and threshold to the test set. Second, three additional construct validity tests (held-out feature testing, visual feature testing, and effect size analysis) empirically demonstrated real risk-related patterns across multiple independent feature domains. Third, the limitation is openly acknowledged, with an honest assessment of its impact on interpretation, as transparency-oriented research ethics require. As future work, external validation against datasets containing annotated risk information, such as DoTA (Yao et al., 2023) or SHRP2 Naturalistic Driving Study crash data, should be undertaken.</w:t>
       </w:r>
     </w:p>
     <w:p>
@@ -7736,7 +7736,7 @@
           <w:sz w:val="22"/>
           <w:szCs w:val="22"/>
         </w:rPr>
-        <w:t xml:space="preserve">Returning to the five research questions posed in Section 1, the findings support the following conclusions (Figure 13). RQ1 is answered affirmatively: multimodal autonomous driving data can be used effectively for driving risk prediction, with a held-out test ROC-AUC of 0.9387 representing strong discriminative performance. RQ2 is answered with nuance: CNN and ViT representations contain genuine risk-relevant information, as determined by validity testing, but flat concatenation into a structured feature matrix introduces noise that marginally degrades overall performance — architectural design matters as much as modality selection. RQ3 is answered clearly: contextual and temporal features are the dominant influence, with behavioural and object-level features providing secondary contributions. RQ4 is answered affirmatively: SHAP values, gain-based importance, group-level importance, and the four-way ablation study together provide model explainability that improves transparency well beyond single aggregate metrics. RQ5 is answered affirmatively: the framework demonstrated robustness across all folds of stratified cross-validation with per-fold fresh labelling, and the ablation study confirmed that the relative contributions of feature groups were consistent.</w:t>
+        <w:t xml:space="preserve">Returning to the five research questions posed in Section 1, the findings support the following conclusions (Figure 13). RQ1 is answered affirmatively: multimodal autonomous driving data can be used effectively for driving risk prediction, with a held-out test ROC-AUC of 0.9387 representing strong discriminative performance. RQ2 is answered with nuance: CNN and ViT representations contain genuine risk-relevant information, as determined by validity testing, but flat concatenation into a structured feature matrix introduces noise that marginally degrades overall performance; architectural design matters as much as modality selection. RQ3 is answered clearly: contextual and temporal features are the dominant influence, with behavioural and object-level features providing secondary contributions. RQ4 is answered affirmatively: SHAP values, gain-based importance, group-level importance, and the four-way ablation study together provide model explainability that improves transparency well beyond single aggregate metrics. RQ5 is answered affirmatively: the framework demonstrated robustness across all folds of stratified cross-validation with per-fold fresh labelling, and the ablation study confirmed that the relative contributions of feature groups were consistent.</w:t>
       </w:r>
     </w:p>
     <w:p>
@@ -7798,7 +7798,7 @@
           <w:sz w:val="20"/>
           <w:szCs w:val="20"/>
         </w:rPr>
-        <w:t xml:space="preserve">Figure 13 — Research question answer summary.</w:t>
+        <w:t xml:space="preserve">Figure 13. Research question answer summary.</w:t>
       </w:r>
     </w:p>
     <w:p>
@@ -7886,7 +7886,7 @@
           <w:sz w:val="22"/>
           <w:szCs w:val="22"/>
         </w:rPr>
-        <w:t xml:space="preserve">The study makes four original contributions to autonomous vehicle safety and multimodal machine learning. First, it presents a novel multimodal driving risk prediction framework combining CNN embeddings, Vision Transformer representations, YOLOv8 object detection, ego-motion telemetry, and contextual indicators within an XGBoost classifier — a combination not previously applied to driving risk prediction. Second, it develops and validates a replicable proxy-risk labelling method using train-only Isolation Forest anomaly detection with three-strategy construct validity testing for datasets lacking ground-truth annotations. Third, it introduces a per-fold fresh-label cross-validation methodology that removes proxy-label leakage across folds, improving on conventional cross-validation for proxy-labelled datasets. Fourth, it provides modality-level explainability through SHAP analysis, gain-based feature group importance, and a four-way ablation study, empirically dispelling contextual-shortcut concerns while showing that flat visual-embedding concatenation is ineffective at this dataset size.</w:t>
+        <w:t xml:space="preserve">The study makes four original contributions to autonomous vehicle safety and multimodal machine learning. First, it presents a novel multimodal driving risk prediction framework combining CNN embeddings, Vision Transformer representations, YOLOv8 object detection, ego-motion telemetry, and contextual indicators within an XGBoost classifier, a combination not previously applied to driving risk prediction. Second, it develops and validates a replicable proxy-risk labelling method using train-only Isolation Forest anomaly detection with three-strategy construct validity testing for datasets lacking ground-truth annotations. Third, it introduces a per-fold fresh-label cross-validation methodology that removes proxy-label leakage across folds, improving on conventional cross-validation for proxy-labelled datasets. Fourth, it provides modality-level explainability through SHAP analysis, gain-based feature group importance, and a four-way ablation study, empirically dispelling contextual-shortcut concerns while showing that flat visual-embedding concatenation is ineffective at this dataset size.</w:t>
       </w:r>
     </w:p>
     <w:p>
@@ -7904,7 +7904,7 @@
           <w:sz w:val="22"/>
           <w:szCs w:val="22"/>
         </w:rPr>
-        <w:t xml:space="preserve">The results carry direct implications for autonomous vehicle safety systems. Because contextual and temporal features contribute most strongly to predicted risk, AV risk assessment systems should prioritise contextual understanding — time of day, illumination, and traffic-period indicators — alongside sensor-based perception. The finding also suggests a graduated deployment policy in which AVs operate with less oversight during daylight hours and increased supervision at night. The marginal effect of CNN/ViT embeddings under flat concatenation indicates that developers of multimodal risk prediction systems must deliberately assess how visual features are architecturally incorporated rather than expecting improvement from additional modalities alone.</w:t>
+        <w:t xml:space="preserve">The results carry direct implications for autonomous vehicle safety systems. Because contextual and temporal features contribute most strongly to predicted risk, AV risk assessment systems should prioritise contextual understanding (time of day, illumination, and traffic-period indicators) alongside sensor-based perception. The finding also suggests a graduated deployment policy in which AVs operate with less oversight during daylight hours and increased supervision at night. The marginal effect of CNN/ViT embeddings under flat concatenation indicates that developers of multimodal risk prediction systems must deliberately assess how visual features are architecturally incorporated rather than expecting improvement from additional modalities alone.</w:t>
       </w:r>
     </w:p>
     <w:p>
@@ -7922,7 +7922,7 @@
           <w:sz w:val="22"/>
           <w:szCs w:val="22"/>
         </w:rPr>
-        <w:t xml:space="preserve">The limitations in Section 6 identify four avenues for future research (Figure 14). First, validating the model against an independent dataset with labelled risk or anomaly instances — such as DoTA (Yao et al., 2023) or SHRP2 Naturalistic Driving Study crash records — would strengthen the evidence for the proxy labelling methodology and enable direct measurement of predictive validity. Second, dedicated visual fusion architectures — separate CNN and ViT branches producing modality-specific risk scores combined via late fusion or learned attention — should be evaluated to unlock the predictive value of visual features beyond flat concatenation. Third, sequence modelling with recurrent or transformer-based architectures applied to entire clips, spanning both ego-motion and visual streams rather than single middle frames, may uncover dynamic risk patterns missed by static feature extraction. Finally, replicating the study across other AV datasets — such as BDD100K (Yu et al., 2020) or Waymo (Sun et al., 2020) — would establish whether the contextual-feature-dominance finding generalises across geographic locations, sensor types, and driving environments.</w:t>
+        <w:t xml:space="preserve">The limitations in Section 6 identify four avenues for future research (Figure 14). First, validating the model against an independent dataset with labelled risk or anomaly instances, such as DoTA (Yao et al., 2023) or SHRP2 Naturalistic Driving Study crash records, would strengthen the evidence for the proxy labelling methodology and enable direct measurement of predictive validity. Second, dedicated visual fusion architectures (separate CNN and ViT branches producing modality-specific risk scores combined via late fusion or learned attention) should be evaluated to unlock the predictive value of visual features beyond flat concatenation. Third, sequence modelling with recurrent or transformer-based architectures applied to entire clips, spanning both ego-motion and visual streams rather than single middle frames, may uncover dynamic risk patterns missed by static feature extraction. Finally, replicating the study across other AV datasets, such as BDD100K (Yu et al., 2020) or Waymo (Sun et al., 2020), would establish whether the contextual-feature-dominance finding generalises across geographic locations, sensor types, and driving environments.</w:t>
       </w:r>
     </w:p>
     <w:p>
@@ -7984,7 +7984,7 @@
           <w:sz w:val="20"/>
           <w:szCs w:val="20"/>
         </w:rPr>
-        <w:t xml:space="preserve">Figure 14 — Future work roadmap.</w:t>
+        <w:t xml:space="preserve">Figure 14. Future work roadmap.</w:t>
       </w:r>
     </w:p>
     <w:p>
@@ -8663,7 +8663,7 @@
           <w:sz w:val="26"/>
           <w:szCs w:val="26"/>
         </w:rPr>
-        <w:t xml:space="preserve">Appendix A — Model and Labelling Configurations</w:t>
+        <w:t xml:space="preserve">Appendix A: Model and Labelling Configurations</w:t>
       </w:r>
     </w:p>
     <w:p>
@@ -8697,7 +8697,7 @@
           <w:sz w:val="20"/>
           <w:szCs w:val="20"/>
         </w:rPr>
-        <w:t xml:space="preserve">Table A.1 — Final XGBoost hyperparameters (Phase 2 gap-aware selection).</w:t>
+        <w:t xml:space="preserve">Table A.1. Final XGBoost hyperparameters (Phase 2 gap-aware selection).</w:t>
       </w:r>
     </w:p>
     <w:tbl>
@@ -9123,7 +9123,7 @@
                 <w:sz w:val="19"/>
                 <w:szCs w:val="19"/>
               </w:rPr>
-              <w:t xml:space="preserve">Capped across all phases — deeper trees cause train score = 1.0 on ~1,500 samples</w:t>
+              <w:t xml:space="preserve">Capped across all phases: deeper trees cause train score = 1.0 on ~1,500 samples</w:t>
             </w:r>
           </w:p>
         </w:tc>
@@ -9325,7 +9325,7 @@
                 <w:sz w:val="19"/>
                 <w:szCs w:val="19"/>
               </w:rPr>
-              <w:t xml:space="preserve">Minimum loss reduction required to split — acts as pruning</w:t>
+              <w:t xml:space="preserve">Minimum loss reduction required to split: acts as pruning</w:t>
             </w:r>
           </w:p>
         </w:tc>
@@ -9527,7 +9527,7 @@
                 <w:sz w:val="19"/>
                 <w:szCs w:val="19"/>
               </w:rPr>
-              <w:t xml:space="preserve">Strong L2 regularisation — most effective paired with low colsample_bytree</w:t>
+              <w:t xml:space="preserve">Strong L2 regularisation: most effective paired with low colsample_bytree</w:t>
             </w:r>
           </w:p>
         </w:tc>
@@ -9628,7 +9628,7 @@
                 <w:sz w:val="19"/>
                 <w:szCs w:val="19"/>
               </w:rPr>
-              <w:t xml:space="preserve">Ratio of negative to positive training instances — addresses class imbalance</w:t>
+              <w:t xml:space="preserve">Ratio of negative to positive training instances: addresses class imbalance</w:t>
             </w:r>
           </w:p>
         </w:tc>
@@ -9830,7 +9830,7 @@
                 <w:sz w:val="19"/>
                 <w:szCs w:val="19"/>
               </w:rPr>
-              <w:t xml:space="preserve">T4 GPU acceleration — Google Colab</w:t>
+              <w:t xml:space="preserve">T4 GPU acceleration: Google Colab</w:t>
             </w:r>
           </w:p>
         </w:tc>
@@ -10056,7 +10056,7 @@
           <w:sz w:val="20"/>
           <w:szCs w:val="20"/>
         </w:rPr>
-        <w:t xml:space="preserve">Table A.2 — Isolation Forest configuration for proxy labelling.</w:t>
+        <w:t xml:space="preserve">Table A.2. Isolation Forest configuration for proxy labelling.</w:t>
       </w:r>
     </w:p>
     <w:tbl>
@@ -10416,7 +10416,7 @@
                 <w:sz w:val="19"/>
                 <w:szCs w:val="19"/>
               </w:rPr>
-              <w:t xml:space="preserve">Training set only — test set never seen during fitting</w:t>
+              <w:t xml:space="preserve">Training set only: test set never seen during fitting</w:t>
             </w:r>
           </w:p>
         </w:tc>
@@ -10645,7 +10645,7 @@
           <w:sz w:val="26"/>
           <w:szCs w:val="26"/>
         </w:rPr>
-        <w:t xml:space="preserve">Appendix B — Extended Model Metrics</w:t>
+        <w:t xml:space="preserve">Appendix B: Extended Model Metrics</w:t>
       </w:r>
     </w:p>
     <w:p>
@@ -10679,7 +10679,7 @@
           <w:sz w:val="20"/>
           <w:szCs w:val="20"/>
         </w:rPr>
-        <w:t xml:space="preserve">Table B.1 — Full classification report: XGBoost final model at threshold 0.4.</w:t>
+        <w:t xml:space="preserve">Table B.1. Full classification report: XGBoost final model at threshold 0.4.</w:t>
       </w:r>
     </w:p>
     <w:tbl>
@@ -11564,7 +11564,7 @@
           <w:sz w:val="20"/>
           <w:szCs w:val="20"/>
         </w:rPr>
-        <w:t xml:space="preserve">Table B.2 — Threshold sensitivity analysis: XGBoost full model.</w:t>
+        <w:t xml:space="preserve">Table B.2. Threshold sensitivity analysis: XGBoost full model.</w:t>
       </w:r>
     </w:p>
     <w:tbl>
@@ -12451,7 +12451,7 @@
           <w:sz w:val="22"/>
           <w:szCs w:val="22"/>
         </w:rPr>
-        <w:t xml:space="preserve">Threshold 0.4 was selected as it provides the highest recall for the high-risk class while maintaining acceptable precision and overall accuracy — a safety-oriented priority in which missed high-risk scenarios carry greater consequence than false alarms.</w:t>
+        <w:t xml:space="preserve">Threshold 0.4 was selected as it provides the highest recall for the high-risk class while maintaining acceptable precision and overall accuracy, a safety-oriented priority in which missed high-risk scenarios carry greater consequence than false alarms.</w:t>
       </w:r>
     </w:p>
     <w:p>
@@ -12467,7 +12467,7 @@
           <w:sz w:val="20"/>
           <w:szCs w:val="20"/>
         </w:rPr>
-        <w:t xml:space="preserve">Table B.3 — Cross-validation per-fold results with per-fold fresh labels.</w:t>
+        <w:t xml:space="preserve">Table B.3. Cross-validation per-fold results with per-fold fresh labels.</w:t>
       </w:r>
     </w:p>
     <w:tbl>
@@ -13605,7 +13605,7 @@
           <w:sz w:val="20"/>
           <w:szCs w:val="20"/>
         </w:rPr>
-        <w:t xml:space="preserve">Table B.4 — Confusion matrix summary: all models at threshold 0.4.</w:t>
+        <w:t xml:space="preserve">Table B.4. Confusion matrix summary: all models at threshold 0.4.</w:t>
       </w:r>
     </w:p>
     <w:tbl>
@@ -14492,7 +14492,7 @@
           <w:sz w:val="22"/>
           <w:szCs w:val="22"/>
         </w:rPr>
-        <w:t xml:space="preserve">XGBoost achieves the highest true-positive count (21 of 28 high-risk clips correctly identified) at the cost of 10 false positives — an acceptable trade-off in a safety-oriented context where missed high-risk scenarios are more consequential than false alarms.</w:t>
+        <w:t xml:space="preserve">XGBoost achieves the highest true-positive count (21 of 28 high-risk clips correctly identified) at the cost of 10 false positives, an acceptable trade-off in a safety-oriented context where missed high-risk scenarios are more consequential than false alarms.</w:t>
       </w:r>
     </w:p>
     <w:sectPr>

</xml_diff>

<commit_message>
Add publication permission note, data availability statement and acknowledgement
</commit_message>
<xml_diff>
--- a/manuscript/Nair_Izima_Multimodal_Driving_Risk_Prediction.docx
+++ b/manuscript/Nair_Izima_Multimodal_Driving_Risk_Prediction.docx
@@ -8037,7 +8037,42 @@
           <w:sz w:val="22"/>
           <w:szCs w:val="22"/>
         </w:rPr>
-        <w:t xml:space="preserve">The authors gratefully acknowledge Dr Subhadeep Chakraborty, co-author of “Automated Vehicle Data Pipeline for Accident Reconstruction: New Insights from LiDAR, Camera and Radar Data” (Beck et al., 2023), for providing access to the article, and Professor Marco Pavone, Distinguished Research Scientist and Director of Autonomous Vehicle Research at NVIDIA and Associate Professor at Stanford University, for addressing questions concerning the use of the NVIDIA PhysicalAI Dataset as the core data source for this research. The authors also thank Dr Suman Gurbani, Dr David Williams, and Mr Assem Abdel Hak of Dublin Business School for foundational instruction in research methods and machine learning, and the Dublin Business School library for access to academic databases and journals.</w:t>
+        <w:t xml:space="preserve">The authors gratefully acknowledge Dr Subhadeep Chakraborty, co-author of “Automated Vehicle Data Pipeline for Accident Reconstruction: New Insights from LiDAR, Camera and Radar Data” (Beck et al., 2023), for providing access to the article, and Professor Marco Pavone, Senior Director of AI at NVIDIA and Associate Professor at Stanford University, for addressing questions concerning the use of the NVIDIA PhysicalAI Dataset as the core data source for this research and for confirming that research built on the dataset may be published. The authors also thank Dr Suman Gurbani, Dr David Williams, and Mr Assem Abdel Hak of Dublin Business School for foundational instruction in research methods and machine learning, and the Dublin Business School library for access to academic databases and journals.</w:t>
+      </w:r>
+    </w:p>
+    <w:p>
+      <w:pPr>
+        <w:pStyle w:val="Heading1"/>
+        <w:spacing w:after="160" w:before="280"/>
+      </w:pPr>
+      <w:r>
+        <w:rPr>
+          <w:rFonts w:ascii="Times New Roman" w:cs="Times New Roman" w:eastAsia="Times New Roman" w:hAnsi="Times New Roman"/>
+          <w:b/>
+          <w:bCs/>
+          <w:color w:val="000000"/>
+          <w:sz w:val="26"/>
+          <w:szCs w:val="26"/>
+        </w:rPr>
+        <w:t xml:space="preserve">Data Availability Statement</w:t>
+      </w:r>
+    </w:p>
+    <w:p>
+      <w:pPr>
+        <w:spacing w:after="160" w:line="276"/>
+        <w:jc w:val="both"/>
+      </w:pPr>
+      <w:r>
+        <w:rPr>
+          <w:rFonts w:ascii="Times New Roman" w:cs="Times New Roman" w:eastAsia="Times New Roman" w:hAnsi="Times New Roman"/>
+          <w:b w:val="false"/>
+          <w:bCs w:val="false"/>
+          <w:i w:val="false"/>
+          <w:iCs w:val="false"/>
+          <w:sz w:val="22"/>
+          <w:szCs w:val="22"/>
+        </w:rPr>
+        <w:t xml:space="preserve">The data analysed in this study come from the NVIDIA PhysicalAI Autonomous Vehicles dataset, available on Hugging Face (https://huggingface.co/datasets/nvidia/PhysicalAI-Autonomous-Vehicles) under the NVIDIA Autonomous Vehicle Dataset License. Permission to publish this research was confirmed by M. Pavone (NVIDIA; personal communication, 6 October 2026). In line with the licence, raw data, derived per-clip data and trained models are not shared. The source code is available at https://github.com/Nair-Shreyas/multimodal-driving-risk-prediction.</w:t>
       </w:r>
     </w:p>
     <w:p>

</xml_diff>